<commit_message>
Entry #048 follow-ups: F13 verifier fix (ICR compound unit; CMS subset shape pinned as known limitation), pressure level 2 -> YELLOW (ADR-047 §8 amended), ADR-045 §8.2/§8.3 marked implemented
Co-Authored-By: Claude Opus 5.5 <noreply@anthropic.com>
</commit_message>
<xml_diff>
--- a/ADR_045.docx
+++ b/ADR_045.docx
@@ -219,7 +219,7 @@
                 <w:sz w:val="20"/>
                 <w:szCs w:val="20"/>
               </w:rPr>
-              <w:t xml:space="preserve">DECIDED — September 20, 2026</w:t>
+              <w:t xml:space="preserve">DECIDED — September 20, 2026. IMPLEMENTATION: §8.2 done September 29, 2026 (Entry #041). §8.3 done September 29, 2026 — built Entry #042, live-verified Entry #048: an out-of-boundary ls raised a Deny / Allow-once prompt (the prompt does not visibly show the guard's reason text), confirmed by the hook's run log (scripts/hooks/traversal_guard.log). Per §8.4 the hook is a speed bump, not a boundary; AC-3 remains NOT MET.</w:t>
             </w:r>
           </w:p>
         </w:tc>
@@ -1830,7 +1830,7 @@
           <w:sz w:val="18"/>
           <w:szCs w:val="18"/>
         </w:rPr>
-        <w:t xml:space="preserve">Sheldon Wheeler — OpenClaw Personal Stack — ADR-045 — Decided September 20, 2026 — Amends ADR-040</w:t>
+        <w:t xml:space="preserve">Sheldon Wheeler — OpenClaw Personal Stack — ADR-045 — Decided September 20, 2026 — §8.2/§8.3 implemented September 29, 2026 — Amends ADR-040</w:t>
       </w:r>
     </w:p>
     <w:sectPr>

</xml_diff>